<commit_message>
Fix DOCX Hebrew verse formatting and methodology generation bugs
</commit_message>
<xml_diff>
--- a/Documents/Psalm study guide/Psalm 44.docx
+++ b/Documents/Psalm study guide/Psalm 44.docx
@@ -551,6 +551,7 @@
                 <w:b/>
                 <w:szCs w:val="24"/>
               </w:rPr>
+              <w:lastRenderedPageBreak/>
               <w:t xml:space="preserve">12. </w:t>
             </w:r>
             <w:r>
@@ -578,12 +579,6 @@
                 <w:rFonts w:ascii="Cambria" w:hAnsi="Cambria"/>
               </w:rPr>
               <w:br/>
-            </w:r>
-            <w:r>
-              <w:rPr>
-                <w:rFonts w:ascii="Cambria" w:hAnsi="Cambria"/>
-              </w:rPr>
-              <w:lastRenderedPageBreak/>
               <w:t>You disperse us among the nations.</w:t>
             </w:r>
           </w:p>
@@ -600,7 +595,6 @@
                 <w:b/>
                 <w:szCs w:val="24"/>
               </w:rPr>
-              <w:lastRenderedPageBreak/>
               <w:t xml:space="preserve">13. </w:t>
             </w:r>
             <w:r>
@@ -1124,6 +1118,7 @@
                 <w:b/>
                 <w:szCs w:val="24"/>
               </w:rPr>
+              <w:lastRenderedPageBreak/>
               <w:t xml:space="preserve">25. </w:t>
             </w:r>
             <w:r>
@@ -1167,7 +1162,6 @@
                 <w:b/>
                 <w:szCs w:val="24"/>
               </w:rPr>
-              <w:lastRenderedPageBreak/>
               <w:t xml:space="preserve">26. </w:t>
             </w:r>
             <w:r>
@@ -2148,56 +2142,17 @@
     </w:p>
     <w:p>
       <w:pPr>
-        <w:pStyle w:val="Heading2"/>
-      </w:pPr>
-      <w:r>
-        <w:t>Verse-by-Verse Commentary</w:t>
-      </w:r>
-    </w:p>
-    <w:p>
-      <w:pPr>
-        <w:pStyle w:val="Heading3"/>
-      </w:pPr>
-      <w:r>
-        <w:t>Verse 27</w:t>
-      </w:r>
-    </w:p>
-    <w:p>
-      <w:pPr>
         <w:pStyle w:val="BodySans"/>
       </w:pPr>
       <w:r>
-        <w:t xml:space="preserve">Verse 23 in Monday/Thursday Tachanun. The sheep-slaughter imagery enters the extended Tachanun (penitential supplication after the Amidah) in both Ashkenazi and Hasidic rites: </w:t>
-      </w:r>
-      <w:bdo w:val="ltr">
-        <w:r>
-          <w:t>לבָוּי</w:t>
-        </w:r>
-        <w:r>
-          <w:t xml:space="preserve"> </w:t>
-        </w:r>
-        <w:r>
-          <w:t>חבַטֶלַ</w:t>
-        </w:r>
-        <w:r>
-          <w:t xml:space="preserve"> </w:t>
-        </w:r>
-        <w:r>
-          <w:t>ןאצֹּכַּ</w:t>
-        </w:r>
-        <w:r>
-          <w:t xml:space="preserve"> </w:t>
-        </w:r>
-        <w:r>
-          <w:t>וּנבְשַׁחְנֶ</w:t>
-        </w:r>
-        <w:r>
-          <w:t>‬</w:t>
-        </w:r>
-        <w:r>
-          <w:t>...‏</w:t>
-        </w:r>
-      </w:bdo>
+        <w:rPr>
+          <w:b/>
+        </w:rPr>
+        <w:t>Verse 27 in Pesukei Dezimra (Daily Morning, All Rites).</w:t>
+      </w:r>
+      <w:r>
+        <w:t xml:space="preserve"> The psalm's closing imperative —</w:t>
+      </w:r>
     </w:p>
     <w:p>
       <w:pPr>
@@ -2212,7 +2167,7 @@
           <w:sz w:val="26"/>
           <w:szCs w:val="26"/>
         </w:rPr>
-        <w:t>וּבְכׇל</w:t>
+        <w:t>קוּמָה</w:t>
       </w:r>
       <w:r>
         <w:rPr>
@@ -2228,7 +2183,7 @@
           <w:sz w:val="26"/>
           <w:szCs w:val="26"/>
         </w:rPr>
-        <w:t>זֹאת</w:t>
+        <w:t>עֶזְרָתָה</w:t>
       </w:r>
       <w:r>
         <w:rPr>
@@ -2244,7 +2199,7 @@
           <w:sz w:val="26"/>
           <w:szCs w:val="26"/>
         </w:rPr>
-        <w:t>שִׁמְךָ</w:t>
+        <w:t>לָּנוּ</w:t>
       </w:r>
       <w:r>
         <w:rPr>
@@ -2260,7 +2215,7 @@
           <w:sz w:val="26"/>
           <w:szCs w:val="26"/>
         </w:rPr>
-        <w:t>לֹא</w:t>
+        <w:t>וּפְדֵנוּ</w:t>
       </w:r>
       <w:r>
         <w:rPr>
@@ -2276,7 +2231,7 @@
           <w:sz w:val="26"/>
           <w:szCs w:val="26"/>
         </w:rPr>
-        <w:t>שָׁכָחְנוּ</w:t>
+        <w:t>לְמַעַן</w:t>
       </w:r>
       <w:r>
         <w:rPr>
@@ -2284,7 +2239,7 @@
           <w:sz w:val="26"/>
           <w:szCs w:val="26"/>
         </w:rPr>
-        <w:t xml:space="preserve">, </w:t>
+        <w:t xml:space="preserve"> </w:t>
       </w:r>
       <w:r>
         <w:rPr>
@@ -2292,15 +2247,31 @@
           <w:sz w:val="26"/>
           <w:szCs w:val="26"/>
         </w:rPr>
-        <w:t>נָא</w:t>
-      </w:r>
+        <w:t>חַסְדֶּךָ</w:t>
+      </w:r>
+    </w:p>
+    <w:p>
+      <w:pPr>
+        <w:pStyle w:val="BodySans"/>
+      </w:pPr>
+      <w:r>
+        <w:t>"Arise and help us, redeem us for the sake of Your steadfast love" — appears verbatim near the opening of Pesukei Dezimra (the "Verses of Praise" section preceding the Shema) at Shacharit (the morning service) across Ashkenazi, Hasidic (Nusach Sefard), and Mizrachi/Sephardic (Edot HaMizrach) rites. It climaxes a chain of petition:</w:t>
+      </w:r>
+    </w:p>
+    <w:p>
+      <w:pPr>
+        <w:pStyle w:val="BodySans"/>
+        <w:bidi/>
+        <w:ind w:left="432" w:right="432"/>
+        <w:jc w:val="right"/>
+      </w:pPr>
       <w:r>
         <w:rPr>
           <w:rFonts w:ascii="Times New Roman" w:hAnsi="Times New Roman"/>
           <w:sz w:val="26"/>
           <w:szCs w:val="26"/>
         </w:rPr>
-        <w:t xml:space="preserve"> </w:t>
+        <w:t>נַפְשֵׁנוּ</w:t>
       </w:r>
       <w:r>
         <w:rPr>
@@ -2308,7 +2279,7 @@
           <w:sz w:val="26"/>
           <w:szCs w:val="26"/>
         </w:rPr>
-        <w:t>אַל</w:t>
+        <w:t xml:space="preserve"> </w:t>
       </w:r>
       <w:r>
         <w:rPr>
@@ -2316,7 +2287,7 @@
           <w:sz w:val="26"/>
           <w:szCs w:val="26"/>
         </w:rPr>
-        <w:t xml:space="preserve"> </w:t>
+        <w:t>חִכְּתָה</w:t>
       </w:r>
       <w:r>
         <w:rPr>
@@ -2324,7 +2295,63 @@
           <w:sz w:val="26"/>
           <w:szCs w:val="26"/>
         </w:rPr>
-        <w:t>תִּשְׁכָּחֵנוּ</w:t>
+        <w:t xml:space="preserve"> </w:t>
+      </w:r>
+      <w:r>
+        <w:rPr>
+          <w:rFonts w:ascii="Times New Roman" w:hAnsi="Times New Roman"/>
+          <w:sz w:val="26"/>
+          <w:szCs w:val="26"/>
+        </w:rPr>
+        <w:t>לַה׳</w:t>
+      </w:r>
+      <w:r>
+        <w:rPr>
+          <w:rFonts w:ascii="Times New Roman" w:hAnsi="Times New Roman"/>
+          <w:sz w:val="26"/>
+          <w:szCs w:val="26"/>
+        </w:rPr>
+        <w:t xml:space="preserve"> </w:t>
+      </w:r>
+      <w:r>
+        <w:rPr>
+          <w:rFonts w:ascii="Times New Roman" w:hAnsi="Times New Roman"/>
+          <w:sz w:val="26"/>
+          <w:szCs w:val="26"/>
+        </w:rPr>
+        <w:t>עֶזְרֵנוּ</w:t>
+      </w:r>
+      <w:r>
+        <w:rPr>
+          <w:rFonts w:ascii="Times New Roman" w:hAnsi="Times New Roman"/>
+          <w:sz w:val="26"/>
+          <w:szCs w:val="26"/>
+        </w:rPr>
+        <w:t xml:space="preserve"> </w:t>
+      </w:r>
+      <w:r>
+        <w:rPr>
+          <w:rFonts w:ascii="Times New Roman" w:hAnsi="Times New Roman"/>
+          <w:sz w:val="26"/>
+          <w:szCs w:val="26"/>
+        </w:rPr>
+        <w:t>וּמָגִנֵּנוּ</w:t>
+      </w:r>
+      <w:r>
+        <w:rPr>
+          <w:rFonts w:ascii="Times New Roman" w:hAnsi="Times New Roman"/>
+          <w:sz w:val="26"/>
+          <w:szCs w:val="26"/>
+        </w:rPr>
+        <w:t xml:space="preserve"> </w:t>
+      </w:r>
+      <w:r>
+        <w:rPr>
+          <w:rFonts w:ascii="Times New Roman" w:hAnsi="Times New Roman"/>
+          <w:sz w:val="26"/>
+          <w:szCs w:val="26"/>
+        </w:rPr>
+        <w:t>הוּא</w:t>
       </w:r>
     </w:p>
     <w:p>
@@ -2332,38 +2359,65 @@
         <w:pStyle w:val="BodySans"/>
       </w:pPr>
       <w:r>
-        <w:t>— "We are reckoned as sheep led to slaughter... Yet despite all this we have not forgotten Your name — please do not forget us." The prayer fuses verses 23 and 18, making unforgotten loyalty the ground for demanding that God not forget Israel.</w:t>
-      </w:r>
-    </w:p>
-    <w:p>
-      <w:pPr>
-        <w:pStyle w:val="BodySans"/>
-      </w:pPr>
-      <w:r>
-        <w:t xml:space="preserve">Verse 24 in Selichot and Neilah. The cry </w:t>
+        <w:t xml:space="preserve">... </w:t>
       </w:r>
       <w:bdo w:val="ltr">
         <w:r>
-          <w:t>ןשַׁיתִ</w:t>
+          <w:t>וּנילֵעָ</w:t>
         </w:r>
         <w:r>
           <w:t xml:space="preserve"> </w:t>
         </w:r>
         <w:r>
-          <w:t>המָּלָ</w:t>
+          <w:t>׳ה</w:t>
         </w:r>
         <w:r>
           <w:t xml:space="preserve"> </w:t>
         </w:r>
         <w:r>
-          <w:t>הרָוּע</w:t>
+          <w:t>ךָדְּסְחַ</w:t>
+        </w:r>
+        <w:r>
+          <w:t xml:space="preserve"> </w:t>
+        </w:r>
+        <w:r>
+          <w:t>יהִיְ</w:t>
         </w:r>
         <w:r>
           <w:t>‬</w:t>
         </w:r>
         <w:r>
-          <w:t>, "Rouse Yourself, why do You sleep?" surfaces in two extreme settings: the Selichot (penitential poems) for the fast of 20 Sivan (commemorating the 1648 Chmielnicki massacres) in the Hasidic rite, and the closing Neilah service of Yom Kippur in the Edot HaMizrach rite. The tradition sanctions the psalm's most audacious accusation precisely when the community confronts historical catastrophe or heaven's final closure.‏</w:t>
-        </w:r>
+          <w:t xml:space="preserve">... </w:t>
+        </w:r>
+        <w:bdo w:val="ltr">
+          <w:r>
+            <w:t>וּנלָּ</w:t>
+          </w:r>
+          <w:r>
+            <w:t xml:space="preserve"> </w:t>
+          </w:r>
+          <w:r>
+            <w:t>התָרָזְעֶ</w:t>
+          </w:r>
+          <w:r>
+            <w:t xml:space="preserve"> </w:t>
+          </w:r>
+          <w:r>
+            <w:t>המָוּק</w:t>
+          </w:r>
+          <w:r>
+            <w:t>‬</w:t>
+          </w:r>
+          <w:r>
+            <w:t xml:space="preserve">, "Our soul waits for YHWH, our help and shield... May Your lovingkindness be upon us... Arise and help us." By placing this cry at the threshold of worship, the compilers ensure the congregation begins each day from a posture of unresolved need — dependent on divine </w:t>
+          </w:r>
+          <w:r>
+            <w:t>חֶסֶד</w:t>
+          </w:r>
+          <w:r>
+            <w:t xml:space="preserve"> before a word of praise is spoken.‏</w:t>
+          </w:r>
+        </w:bdo>
       </w:bdo>
     </w:p>
     <w:p>
@@ -2371,63 +2425,291 @@
         <w:pStyle w:val="BodySans"/>
       </w:pPr>
       <w:r>
-        <w:lastRenderedPageBreak/>
-        <w:t xml:space="preserve">Verse 17 in Yom Kippur Musaf. The phrase </w:t>
-      </w:r>
-      <w:r>
-        <w:t>מְחָרֵף</w:t>
-      </w:r>
-      <w:r>
-        <w:t xml:space="preserve"> </w:t>
-      </w:r>
-      <w:r>
-        <w:t>וּמְגַדֵּף</w:t>
-      </w:r>
-      <w:r>
-        <w:t xml:space="preserve">,‎ "taunter and blasphemer," enters the Ashkenazi machzor through the piyyut "Eleh Ezkerah," narrating the Roman execution of the Ten Martyrs: </w:t>
+        <w:rPr>
+          <w:b/>
+        </w:rPr>
+        <w:t>Verse 23 in Monday/Thursday Tachanun.</w:t>
+      </w:r>
+      <w:r>
+        <w:t xml:space="preserve"> The sheep-slaughter imagery enters the extended Tachanun (penitential supplication after the Amidah) in both Ashkenazi and Hasidic rites: </w:t>
       </w:r>
       <w:bdo w:val="ltr">
         <w:r>
-          <w:t>הרָוֹת</w:t>
+          <w:t>לבָוּי</w:t>
         </w:r>
         <w:r>
           <w:t xml:space="preserve"> </w:t>
         </w:r>
         <w:r>
-          <w:t>ירֵבְדִּ</w:t>
+          <w:t>חבַטֶלַ</w:t>
         </w:r>
         <w:r>
           <w:t xml:space="preserve"> </w:t>
         </w:r>
         <w:r>
-          <w:t>לעַ</w:t>
+          <w:t>ןאצֹּכַּ</w:t>
         </w:r>
         <w:r>
           <w:t xml:space="preserve"> </w:t>
         </w:r>
         <w:r>
-          <w:t>ףדֵּגַמְוּ</w:t>
-        </w:r>
-        <w:r>
-          <w:t xml:space="preserve"> </w:t>
-        </w:r>
-        <w:r>
-          <w:t>ףרֵחָמְוּ</w:t>
+          <w:t>וּנבְשַׁחְנֶ</w:t>
         </w:r>
         <w:r>
           <w:t>‬</w:t>
         </w:r>
         <w:r>
-          <w:t>, "taunting and blaspheming over the words of Torah." The psalm's vocabulary of insult is mapped onto the paradigmatic narrative of righteous Jewish suffering.‏</w:t>
+          <w:t>...‏</w:t>
         </w:r>
       </w:bdo>
     </w:p>
     <w:p>
       <w:pPr>
         <w:pStyle w:val="BodySans"/>
-      </w:pPr>
-      <w:r>
-        <w:t xml:space="preserve">Verse 5 in Motzaei Shabbat. The imperative </w:t>
+        <w:bidi/>
+        <w:ind w:left="432" w:right="432"/>
+        <w:jc w:val="right"/>
+      </w:pPr>
+      <w:r>
+        <w:rPr>
+          <w:rFonts w:ascii="Times New Roman" w:hAnsi="Times New Roman"/>
+          <w:sz w:val="26"/>
+          <w:szCs w:val="26"/>
+        </w:rPr>
+        <w:t>וּבְכׇל</w:t>
+      </w:r>
+      <w:r>
+        <w:rPr>
+          <w:rFonts w:ascii="Times New Roman" w:hAnsi="Times New Roman"/>
+          <w:sz w:val="26"/>
+          <w:szCs w:val="26"/>
+        </w:rPr>
+        <w:t xml:space="preserve"> </w:t>
+      </w:r>
+      <w:r>
+        <w:rPr>
+          <w:rFonts w:ascii="Times New Roman" w:hAnsi="Times New Roman"/>
+          <w:sz w:val="26"/>
+          <w:szCs w:val="26"/>
+        </w:rPr>
+        <w:t>זֹאת</w:t>
+      </w:r>
+      <w:r>
+        <w:rPr>
+          <w:rFonts w:ascii="Times New Roman" w:hAnsi="Times New Roman"/>
+          <w:sz w:val="26"/>
+          <w:szCs w:val="26"/>
+        </w:rPr>
+        <w:t xml:space="preserve"> </w:t>
+      </w:r>
+      <w:r>
+        <w:rPr>
+          <w:rFonts w:ascii="Times New Roman" w:hAnsi="Times New Roman"/>
+          <w:sz w:val="26"/>
+          <w:szCs w:val="26"/>
+        </w:rPr>
+        <w:t>שִׁמְךָ</w:t>
+      </w:r>
+      <w:r>
+        <w:rPr>
+          <w:rFonts w:ascii="Times New Roman" w:hAnsi="Times New Roman"/>
+          <w:sz w:val="26"/>
+          <w:szCs w:val="26"/>
+        </w:rPr>
+        <w:t xml:space="preserve"> </w:t>
+      </w:r>
+      <w:r>
+        <w:rPr>
+          <w:rFonts w:ascii="Times New Roman" w:hAnsi="Times New Roman"/>
+          <w:sz w:val="26"/>
+          <w:szCs w:val="26"/>
+        </w:rPr>
+        <w:t>לֹא</w:t>
+      </w:r>
+      <w:r>
+        <w:rPr>
+          <w:rFonts w:ascii="Times New Roman" w:hAnsi="Times New Roman"/>
+          <w:sz w:val="26"/>
+          <w:szCs w:val="26"/>
+        </w:rPr>
+        <w:t xml:space="preserve"> </w:t>
+      </w:r>
+      <w:r>
+        <w:rPr>
+          <w:rFonts w:ascii="Times New Roman" w:hAnsi="Times New Roman"/>
+          <w:sz w:val="26"/>
+          <w:szCs w:val="26"/>
+        </w:rPr>
+        <w:t>שָׁכָחְנוּ</w:t>
+      </w:r>
+      <w:r>
+        <w:rPr>
+          <w:rFonts w:ascii="Times New Roman" w:hAnsi="Times New Roman"/>
+          <w:sz w:val="26"/>
+          <w:szCs w:val="26"/>
+        </w:rPr>
+        <w:t xml:space="preserve">, </w:t>
+      </w:r>
+      <w:r>
+        <w:rPr>
+          <w:rFonts w:ascii="Times New Roman" w:hAnsi="Times New Roman"/>
+          <w:sz w:val="26"/>
+          <w:szCs w:val="26"/>
+        </w:rPr>
+        <w:t>נָא</w:t>
+      </w:r>
+      <w:r>
+        <w:rPr>
+          <w:rFonts w:ascii="Times New Roman" w:hAnsi="Times New Roman"/>
+          <w:sz w:val="26"/>
+          <w:szCs w:val="26"/>
+        </w:rPr>
+        <w:t xml:space="preserve"> </w:t>
+      </w:r>
+      <w:r>
+        <w:rPr>
+          <w:rFonts w:ascii="Times New Roman" w:hAnsi="Times New Roman"/>
+          <w:sz w:val="26"/>
+          <w:szCs w:val="26"/>
+        </w:rPr>
+        <w:t>אַל</w:t>
+      </w:r>
+      <w:r>
+        <w:rPr>
+          <w:rFonts w:ascii="Times New Roman" w:hAnsi="Times New Roman"/>
+          <w:sz w:val="26"/>
+          <w:szCs w:val="26"/>
+        </w:rPr>
+        <w:t xml:space="preserve"> </w:t>
+      </w:r>
+      <w:r>
+        <w:rPr>
+          <w:rFonts w:ascii="Times New Roman" w:hAnsi="Times New Roman"/>
+          <w:sz w:val="26"/>
+          <w:szCs w:val="26"/>
+        </w:rPr>
+        <w:t>תִּשְׁכָּחֵנוּ</w:t>
+      </w:r>
+    </w:p>
+    <w:p>
+      <w:pPr>
+        <w:pStyle w:val="BodySans"/>
+      </w:pPr>
+      <w:r>
+        <w:lastRenderedPageBreak/>
+        <w:t>— "We are reckoned as sheep led to slaughter... Yet despite all this we have not forgotten Your name — please do not forget us." The prayer fuses verses 23 and 18, making unforgotten loyalty the ground for demanding that God not forget Israel.</w:t>
+      </w:r>
+    </w:p>
+    <w:p>
+      <w:pPr>
+        <w:pStyle w:val="BodySans"/>
+      </w:pPr>
+      <w:r>
+        <w:rPr>
+          <w:b/>
+        </w:rPr>
+        <w:t>Verse 24 in Selichot and Neilah.</w:t>
+      </w:r>
+      <w:r>
+        <w:t xml:space="preserve"> The cry </w:t>
+      </w:r>
+      <w:bdo w:val="ltr">
+        <w:r>
+          <w:t>ןשַׁיתִ</w:t>
+        </w:r>
+        <w:r>
+          <w:t xml:space="preserve"> </w:t>
+        </w:r>
+        <w:r>
+          <w:t>המָּלָ</w:t>
+        </w:r>
+        <w:r>
+          <w:t xml:space="preserve"> </w:t>
+        </w:r>
+        <w:r>
+          <w:t>הרָוּע</w:t>
+        </w:r>
+        <w:r>
+          <w:t>‬</w:t>
+        </w:r>
+        <w:r>
+          <w:t>, "Rouse Yourself, why do You sleep?" surfaces in two extreme settings: the Selichot (penitential poems) for the fast of 20 Sivan (commemorating the 1648 Chmielnicki massacres) in the Hasidic rite, and the closing Neilah service of Yom Kippur in the Edot HaMizrach rite. The tradition sanctions the psalm's most audacious accusation precisely when the community confronts historical catastrophe or heaven's final closure.‏</w:t>
+        </w:r>
+      </w:bdo>
+    </w:p>
+    <w:p>
+      <w:pPr>
+        <w:pStyle w:val="BodySans"/>
+      </w:pPr>
+      <w:r>
+        <w:rPr>
+          <w:b/>
+        </w:rPr>
+        <w:t>Verse 17 in Yom Kippur Musaf.</w:t>
+      </w:r>
+      <w:r>
+        <w:t xml:space="preserve"> The phrase </w:t>
+      </w:r>
+      <w:r>
+        <w:t>מְחָרֵף</w:t>
+      </w:r>
+      <w:r>
+        <w:t xml:space="preserve"> </w:t>
+      </w:r>
+      <w:r>
+        <w:t>וּמְגַדֵּף</w:t>
+      </w:r>
+      <w:r>
+        <w:t xml:space="preserve">,‎ "taunter and blasphemer," enters the Ashkenazi machzor through the piyyut "Eleh Ezkerah," narrating the Roman execution of the Ten Martyrs: </w:t>
+      </w:r>
+      <w:bdo w:val="ltr">
+        <w:r>
+          <w:t>הרָוֹת</w:t>
+        </w:r>
+        <w:r>
+          <w:t xml:space="preserve"> </w:t>
+        </w:r>
+        <w:r>
+          <w:t>ירֵבְדִּ</w:t>
+        </w:r>
+        <w:r>
+          <w:t xml:space="preserve"> </w:t>
+        </w:r>
+        <w:r>
+          <w:t>לעַ</w:t>
+        </w:r>
+        <w:r>
+          <w:t xml:space="preserve"> </w:t>
+        </w:r>
+        <w:r>
+          <w:t>ףדֵּגַמְוּ</w:t>
+        </w:r>
+        <w:r>
+          <w:t xml:space="preserve"> </w:t>
+        </w:r>
+        <w:r>
+          <w:t>ףרֵחָמְוּ</w:t>
+        </w:r>
+        <w:r>
+          <w:t>‬</w:t>
+        </w:r>
+        <w:r>
+          <w:t>, "taunting and blaspheming over the words of Torah." The psalm's vocabulary of insult is mapped onto the paradigmatic narrative of righteous Jewish suffering.‏</w:t>
+        </w:r>
+      </w:bdo>
+    </w:p>
+    <w:p>
+      <w:pPr>
+        <w:pStyle w:val="BodySans"/>
+      </w:pPr>
+      <w:r>
+        <w:rPr>
+          <w:b/>
+        </w:rPr>
+        <w:t>Verse 5 in Motzaei Shabbat.</w:t>
+      </w:r>
+      <w:r>
+        <w:t xml:space="preserve"> The imperative </w:t>
       </w:r>
       <w:bdo w:val="ltr">
         <w:r>
@@ -2530,6 +2812,14 @@
     </w:p>
     <w:p>
       <w:pPr>
+        <w:pStyle w:val="Heading2"/>
+      </w:pPr>
+      <w:r>
+        <w:t>Verse-by-Verse Commentary</w:t>
+      </w:r>
+    </w:p>
+    <w:p>
+      <w:pPr>
         <w:pStyle w:val="Heading3"/>
       </w:pPr>
       <w:r>
@@ -2642,6 +2932,7 @@
             <w:t xml:space="preserve"> </w:t>
           </w:r>
           <w:r>
+            <w:lastRenderedPageBreak/>
             <w:t>הקָבְדָּ</w:t>
           </w:r>
           <w:r>
@@ -2687,7 +2978,6 @@
         <w:pStyle w:val="Heading3"/>
       </w:pPr>
       <w:r>
-        <w:lastRenderedPageBreak/>
         <w:t>Verse 2-4</w:t>
       </w:r>
     </w:p>
@@ -3118,7 +3408,11 @@
             <w:t xml:space="preserve">, "Plucked </w:t>
           </w:r>
           <w:r>
-            <w:t>up in fury, she was hurled to the ground." The psalm's choice of this metaphor for settlement implicitly carries the threat of displacement within it.‏</w:t>
+            <w:t xml:space="preserve">up in fury, she was hurled to the ground." The </w:t>
+          </w:r>
+          <w:r>
+            <w:lastRenderedPageBreak/>
+            <w:t>psalm's choice of this metaphor for settlement implicitly carries the threat of displacement within it.‏</w:t>
           </w:r>
         </w:bdo>
       </w:bdo>
@@ -3169,11 +3463,7 @@
         <w:t>פָּנֶיךָ</w:t>
       </w:r>
       <w:r>
-        <w:t xml:space="preserve">,‎ "the light of Your face," draws directly on the </w:t>
-      </w:r>
-      <w:r>
-        <w:lastRenderedPageBreak/>
-        <w:t xml:space="preserve">Aaronic blessing: </w:t>
+        <w:t xml:space="preserve">,‎ "the light of Your face," draws directly on the Aaronic blessing: </w:t>
       </w:r>
       <w:bdo w:val="ltr">
         <w:r>
@@ -3342,6 +3632,7 @@
         <w:pStyle w:val="BodySans"/>
       </w:pPr>
       <w:r>
+        <w:lastRenderedPageBreak/>
         <w:t xml:space="preserve">The choice of "Jacob" rather than "Israel" is unexplained but suggestive. Ibn Ezra connects it to Genesis 48:16: </w:t>
       </w:r>
       <w:bdo w:val="ltr">
@@ -3445,7 +3736,6 @@
         <w:pStyle w:val="Heading3"/>
       </w:pPr>
       <w:r>
-        <w:lastRenderedPageBreak/>
         <w:t>Verse 6-8</w:t>
       </w:r>
     </w:p>
@@ -3839,7 +4129,11 @@
         <w:t>Henry V</w:t>
       </w:r>
       <w:r>
-        <w:t xml:space="preserve"> provides a useful counterpoint to the psalm's theology of divine credit. After Agincourt, Henry commands: "O God, thy arm was here; / And not to us, but to thy arm alone, / Ascribe we all!" (</w:t>
+        <w:t xml:space="preserve"> provides a useful counterpoint to the psalm's theology of divine credit. After Agincourt, Henry commands: "O God, thy arm was here; / And not to us, but to </w:t>
+      </w:r>
+      <w:r>
+        <w:lastRenderedPageBreak/>
+        <w:t>thy arm alone, / Ascribe we all!" (</w:t>
       </w:r>
       <w:r>
         <w:rPr>
@@ -3848,10 +4142,10 @@
         <w:t>Henry V</w:t>
       </w:r>
       <w:r>
-        <w:t xml:space="preserve"> 4.8). The rhetoric is similar — deny human strength, credit the divine arm. But Shakespeare's king deploys this formula to enforce humility upon a victorious army, while the psalmist deploys the same formula as a bitter prelude to defeat. The same theology of divine credit produces, in one case, gratitud</w:t>
-      </w:r>
-      <w:r>
-        <w:t>e; in the other, accusation.</w:t>
+        <w:t xml:space="preserve"> 4.8). The rhetoric is similar — deny human strength, credit the divine arm. But Shakespeare's king deploys this formula to enforce humility upon a victorious army, while the psalmist deploys the same formula as a bitter prelude to defeat. The same theology of divine credit produces, in one case, gratitude; in t</w:t>
+      </w:r>
+      <w:r>
+        <w:t>he other, accusation.</w:t>
       </w:r>
     </w:p>
     <w:p>
@@ -3995,7 +4289,6 @@
         <w:pStyle w:val="BodySans"/>
       </w:pPr>
       <w:r>
-        <w:lastRenderedPageBreak/>
         <w:t xml:space="preserve">This is the summit — the highest point of praise before the abyss. The phrase </w:t>
       </w:r>
       <w:r>
@@ -4205,7 +4498,11 @@
           <w:t>‬</w:t>
         </w:r>
         <w:r>
-          <w:t>, "Why, O God, have You rejected us forever?" The two maskil-psalms share vocabulary, accusatory tone, and an unresolved ending — twi</w:t>
+          <w:t xml:space="preserve">, "Why, O God, have You rejected us forever?" The two maskil-psalms share </w:t>
+        </w:r>
+        <w:r>
+          <w:lastRenderedPageBreak/>
+          <w:t>vocabulary, accusatory tone, and an unresolved ending — twi</w:t>
         </w:r>
         <w:r>
           <w:t>n legal briefs filed against the same defendant.‏</w:t>
@@ -4321,7 +4618,6 @@
         <w:pStyle w:val="BodySans"/>
       </w:pPr>
       <w:r>
-        <w:lastRenderedPageBreak/>
         <w:t>Lincoln's Second Inaugural Address captures the theological vertigo of a community whose God will not march with its armies: "Both read the same Bible and pray to the same God, and each invokes His aid against the other. The prayers of both could not be answered." Lincoln reaches the conclusion the psalmist refuses to accept: that God may have purposes aligned with no nation's military objectives.</w:t>
       </w:r>
     </w:p>
@@ -4576,7 +4872,11 @@
         <w:t>רְצִיתָם</w:t>
       </w:r>
       <w:r>
-        <w:t xml:space="preserve">,‎ v. 4). Now God abandons without apparent cause. The parallel is symmetrical: unearned favor, unearned disaster. The word </w:t>
+        <w:t xml:space="preserve">,‎ v. 4). Now God abandons without apparent cause. The parallel is </w:t>
+      </w:r>
+      <w:r>
+        <w:lastRenderedPageBreak/>
+        <w:t xml:space="preserve">symmetrical: unearned favor, unearned disaster. The word </w:t>
       </w:r>
       <w:r>
         <w:t>הוֹן</w:t>
@@ -4637,7 +4937,6 @@
         <w:pStyle w:val="Heading3"/>
       </w:pPr>
       <w:r>
-        <w:lastRenderedPageBreak/>
         <w:t>Verse 14-15</w:t>
       </w:r>
     </w:p>
@@ -5033,6 +5332,7 @@
         <w:pStyle w:val="Heading3"/>
       </w:pPr>
       <w:r>
+        <w:lastRenderedPageBreak/>
         <w:t>Verse 16-17</w:t>
       </w:r>
     </w:p>
@@ -5195,7 +5495,6 @@
         <w:pStyle w:val="BodySans"/>
       </w:pPr>
       <w:r>
-        <w:lastRenderedPageBreak/>
         <w:t xml:space="preserve">The pair </w:t>
       </w:r>
       <w:r>
@@ -5630,7 +5929,11 @@
         <w:t>שְׁכַחֲנוּךָ</w:t>
       </w:r>
       <w:r>
-        <w:t xml:space="preserve"> bears a direct-object suffix, literally "we-forgot-You" — not "we forgot Your name" or "we forgot Your law" but the divine person directly. This is an unusually intimate construction. Deuteronomy uses the root </w:t>
+        <w:t xml:space="preserve"> bears a direct-object suffix, literally "we-forgot-You" — not "we forgot Your name" or "we forgot Your law" but the divine person directly. This is an unusually intimate </w:t>
+      </w:r>
+      <w:r>
+        <w:lastRenderedPageBreak/>
+        <w:t xml:space="preserve">construction. Deuteronomy uses the root </w:t>
       </w:r>
       <w:r>
         <w:t>שׁכח</w:t>
@@ -5706,11 +6009,7 @@
             <w:t>לֹא</w:t>
           </w:r>
           <w:r>
-            <w:t xml:space="preserve"> as governing both </w:t>
-          </w:r>
-          <w:r>
-            <w:lastRenderedPageBreak/>
-            <w:t>halves: "Our heart did not turn back, nor did our steps swerve." Malbim offers a more daring reading: "Even though our steps sometime</w:t>
+            <w:t xml:space="preserve"> as governing both halves: "Our heart did not turn back, nor did our steps swerve." Malbim offers a more daring reading: "Even though our steps sometime</w:t>
           </w:r>
           <w:r>
             <w:t>s swerved from Your path because of the burden of exile, our heart did not retreat" — a concessive admission of imperfect behavior alongside sincere intent. Ibn Ezra likewise treats the negative as carrying across.‏</w:t>
@@ -5981,7 +6280,11 @@
         <w:t>תַּנִּינִם</w:t>
       </w:r>
       <w:r>
-        <w:t xml:space="preserve"> in the waters). Many translations follow the jackal/desolation reading. Rashi opts for desert desolation: "a wilderness, a place of serpents." Radak takes a middle path: "He compared the Babylonians who rule ove</w:t>
+        <w:t xml:space="preserve"> in the waters). Many translations follow the jackal/desolation reading. </w:t>
+      </w:r>
+      <w:r>
+        <w:lastRenderedPageBreak/>
+        <w:t>Rashi opts for desert desolation: "a wilderness, a place of serpents." Radak takes a middle path: "He compared the Babylonians who rule ove</w:t>
       </w:r>
       <w:r>
         <w:t>r us to tannin, which has cruelty." The theological stakes are considerable: jackals place Israel in historical desolation; sea-monsters place Israel in cosmic anti-creation. If God has consigned His people to the realm of primordial chaos, He has undone His own creative work.‏</w:t>
@@ -6023,7 +6326,6 @@
           <w:sz w:val="26"/>
           <w:szCs w:val="26"/>
         </w:rPr>
-        <w:lastRenderedPageBreak/>
         <w:t>אֶרֶץ</w:t>
       </w:r>
       <w:r>
@@ -6320,7 +6622,11 @@
         <w:t>טִבְחָה</w:t>
       </w:r>
       <w:r>
-        <w:t xml:space="preserve"> ("sheep for slaughter"), escalates from verse 12's </w:t>
+        <w:t xml:space="preserve"> ("sheep for </w:t>
+      </w:r>
+      <w:r>
+        <w:lastRenderedPageBreak/>
+        <w:t xml:space="preserve">slaughter"), escalates from verse 12's </w:t>
       </w:r>
       <w:r>
         <w:t>כְּצֹאן</w:t>
@@ -6390,11 +6696,7 @@
         <w:t>עַל</w:t>
       </w:r>
       <w:r>
-        <w:t xml:space="preserve"> + suffix carries a blunter accusatory force </w:t>
-      </w:r>
-      <w:r>
-        <w:lastRenderedPageBreak/>
-        <w:t xml:space="preserve">than the more purposive </w:t>
+        <w:t xml:space="preserve"> + suffix carries a blunter accusatory force than the more purposive </w:t>
       </w:r>
       <w:r>
         <w:t>לְמַעַן</w:t>
@@ -6769,7 +7071,11 @@
           <w:t>‬</w:t>
         </w:r>
         <w:r>
-          <w:t>, "Perhaps he is asleep and will awaken" (1 Kgs 18:27). The psalmist turns that mockery on YHWH Himself — a rhetorical escalation designed to provoke divine response through the sheer audacity of the comparison.‏</w:t>
+          <w:t xml:space="preserve">, "Perhaps he is asleep and will awaken" (1 Kgs 18:27). The psalmist turns that mockery on </w:t>
+        </w:r>
+        <w:r>
+          <w:lastRenderedPageBreak/>
+          <w:t>YHWH Himself — a rhetorical escalation designed to provoke divine response through the sheer audacity of the comparison.‏</w:t>
         </w:r>
       </w:bdo>
     </w:p>
@@ -6815,7 +7121,6 @@
         <w:pStyle w:val="BodySans"/>
       </w:pPr>
       <w:r>
-        <w:lastRenderedPageBreak/>
         <w:t xml:space="preserve">The name </w:t>
       </w:r>
       <w:r>
@@ -7067,6 +7372,7 @@
         <w:pStyle w:val="BodySans"/>
       </w:pPr>
       <w:r>
+        <w:lastRenderedPageBreak/>
         <w:t xml:space="preserve">The word pair </w:t>
       </w:r>
       <w:r>
@@ -7132,7 +7438,6 @@
         <w:pStyle w:val="BodySans"/>
       </w:pPr>
       <w:r>
-        <w:lastRenderedPageBreak/>
         <w:t xml:space="preserve">And here the Korahite attribution achieves its deepest resonance. Korah was swallowed by the </w:t>
       </w:r>
       <w:r>
@@ -7271,10 +7576,11 @@
         <w:pStyle w:val="BodySans"/>
       </w:pPr>
       <w:r>
-        <w:t>The psalm ends without an answer. No theophany, no oracle, no comfort. In the Psalter's editorial sequence, Psalm 45 follows immediately — a royal wedding song overflowing with myrrh and joy. Whether the juxtaposition is intentional or not, it is startling: the community that lies face-down in the dust is succeeded without transition by a king whose robes smell of perfume. The tradition that placed these psalms side by side may have understood something the individual psalm cannot say on its own: that the c</w:t>
-      </w:r>
-      <w:r>
-        <w:t>ry from the dust and the song of celebration exist in the same canon, unreconciled, and both are true.</w:t>
+        <w:t xml:space="preserve">The psalm ends without an answer. No theophany, no oracle, no comfort. In the Psalter's editorial sequence, Psalm 45 follows immediately — a royal wedding song overflowing with myrrh and joy. Whether the juxtaposition is intentional or not, it is startling: the community that lies face-down in the dust is succeeded without transition by a king whose robes smell of perfume. The tradition that placed these psalms side by side may have understood </w:t>
+      </w:r>
+      <w:r>
+        <w:lastRenderedPageBreak/>
+        <w:t>something the individual psalm cannot say on its own: that the cry from the dust and the song of celebration exist in the same canon, unreconciled, and both are true.</w:t>
       </w:r>
     </w:p>
     <w:p>
@@ -7987,31 +8293,31 @@
       </w:rPr>
     </w:lvl>
   </w:abstractNum>
-  <w:num w:numId="1" w16cid:durableId="607390480">
+  <w:num w:numId="1" w16cid:durableId="1897818446">
     <w:abstractNumId w:val="8"/>
   </w:num>
-  <w:num w:numId="2" w16cid:durableId="1572305190">
+  <w:num w:numId="2" w16cid:durableId="1539004412">
     <w:abstractNumId w:val="6"/>
   </w:num>
-  <w:num w:numId="3" w16cid:durableId="1851287226">
+  <w:num w:numId="3" w16cid:durableId="408624280">
     <w:abstractNumId w:val="5"/>
   </w:num>
-  <w:num w:numId="4" w16cid:durableId="1156338352">
+  <w:num w:numId="4" w16cid:durableId="1393189713">
     <w:abstractNumId w:val="4"/>
   </w:num>
-  <w:num w:numId="5" w16cid:durableId="1167861529">
+  <w:num w:numId="5" w16cid:durableId="1248155785">
     <w:abstractNumId w:val="7"/>
   </w:num>
-  <w:num w:numId="6" w16cid:durableId="567568937">
+  <w:num w:numId="6" w16cid:durableId="1241134371">
     <w:abstractNumId w:val="3"/>
   </w:num>
-  <w:num w:numId="7" w16cid:durableId="314996977">
+  <w:num w:numId="7" w16cid:durableId="1783069476">
     <w:abstractNumId w:val="2"/>
   </w:num>
-  <w:num w:numId="8" w16cid:durableId="334723828">
+  <w:num w:numId="8" w16cid:durableId="679624003">
     <w:abstractNumId w:val="1"/>
   </w:num>
-  <w:num w:numId="9" w16cid:durableId="1391419083">
+  <w:num w:numId="9" w16cid:durableId="1879581402">
     <w:abstractNumId w:val="0"/>
   </w:num>
 </w:numbering>

</xml_diff>